<commit_message>
Se organzian los documentos para que traigan los datos correctos
</commit_message>
<xml_diff>
--- a/back/src/static/contratos/AcuerdoConfidencialdiadCapital.docx
+++ b/back/src/static/contratos/AcuerdoConfidencialdiadCapital.docx
@@ -23,13 +23,29 @@
           <w:rFonts w:ascii="Century Gothic" w:eastAsia="Calibri" w:hAnsi="Century Gothic" w:cs="Times New Roman"/>
           <w:lang w:val="es-CO"/>
         </w:rPr>
-        <w:t>{EmpresaRepresentanteLegal}</w:t>
-      </w:r>
+        <w:t>{</w:t>
+      </w:r>
+      <w:proofErr w:type="spellStart"/>
       <w:r>
         <w:rPr>
           <w:rFonts w:ascii="Century Gothic" w:eastAsia="Calibri" w:hAnsi="Century Gothic" w:cs="Times New Roman"/>
           <w:lang w:val="es-CO"/>
         </w:rPr>
+        <w:t>EmpresaRepresentanteLegal</w:t>
+      </w:r>
+      <w:proofErr w:type="spellEnd"/>
+      <w:r>
+        <w:rPr>
+          <w:rFonts w:ascii="Century Gothic" w:eastAsia="Calibri" w:hAnsi="Century Gothic" w:cs="Times New Roman"/>
+          <w:lang w:val="es-CO"/>
+        </w:rPr>
+        <w:t>}</w:t>
+      </w:r>
+      <w:r>
+        <w:rPr>
+          <w:rFonts w:ascii="Century Gothic" w:eastAsia="Calibri" w:hAnsi="Century Gothic" w:cs="Times New Roman"/>
+          <w:lang w:val="es-CO"/>
+        </w:rPr>
         <w:t xml:space="preserve">, mayor de edad, identificada con C.C. </w:t>
       </w:r>
       <w:r>
@@ -37,13 +53,29 @@
           <w:rFonts w:ascii="Century Gothic" w:eastAsia="Calibri" w:hAnsi="Century Gothic" w:cs="Times New Roman"/>
           <w:lang w:val="es-CO"/>
         </w:rPr>
-        <w:t>{EmpresaCedulaRepresentante}</w:t>
-      </w:r>
+        <w:t>{</w:t>
+      </w:r>
+      <w:proofErr w:type="spellStart"/>
       <w:r>
         <w:rPr>
           <w:rFonts w:ascii="Century Gothic" w:eastAsia="Calibri" w:hAnsi="Century Gothic" w:cs="Times New Roman"/>
           <w:lang w:val="es-CO"/>
         </w:rPr>
+        <w:t>EmpresaCedulaRepresentante</w:t>
+      </w:r>
+      <w:proofErr w:type="spellEnd"/>
+      <w:r>
+        <w:rPr>
+          <w:rFonts w:ascii="Century Gothic" w:eastAsia="Calibri" w:hAnsi="Century Gothic" w:cs="Times New Roman"/>
+          <w:lang w:val="es-CO"/>
+        </w:rPr>
+        <w:t>}</w:t>
+      </w:r>
+      <w:r>
+        <w:rPr>
+          <w:rFonts w:ascii="Century Gothic" w:eastAsia="Calibri" w:hAnsi="Century Gothic" w:cs="Times New Roman"/>
+          <w:lang w:val="es-CO"/>
+        </w:rPr>
         <w:t xml:space="preserve">, obrando en su calidad de Representante Legal de </w:t>
       </w:r>
       <w:r>
@@ -51,13 +83,29 @@
           <w:rFonts w:ascii="Century Gothic" w:eastAsia="Calibri" w:hAnsi="Century Gothic" w:cs="Times New Roman"/>
           <w:lang w:val="es-CO"/>
         </w:rPr>
-        <w:t>{EmpresaRazonSocial}</w:t>
-      </w:r>
+        <w:t>{</w:t>
+      </w:r>
+      <w:proofErr w:type="spellStart"/>
       <w:r>
         <w:rPr>
           <w:rFonts w:ascii="Century Gothic" w:eastAsia="Calibri" w:hAnsi="Century Gothic" w:cs="Times New Roman"/>
           <w:lang w:val="es-CO"/>
         </w:rPr>
+        <w:t>EmpresaRazonSocial</w:t>
+      </w:r>
+      <w:proofErr w:type="spellEnd"/>
+      <w:r>
+        <w:rPr>
+          <w:rFonts w:ascii="Century Gothic" w:eastAsia="Calibri" w:hAnsi="Century Gothic" w:cs="Times New Roman"/>
+          <w:lang w:val="es-CO"/>
+        </w:rPr>
+        <w:t>}</w:t>
+      </w:r>
+      <w:r>
+        <w:rPr>
+          <w:rFonts w:ascii="Century Gothic" w:eastAsia="Calibri" w:hAnsi="Century Gothic" w:cs="Times New Roman"/>
+          <w:lang w:val="es-CO"/>
+        </w:rPr>
         <w:t xml:space="preserve">., persona jurídica identificada con NIT </w:t>
       </w:r>
       <w:r>
@@ -65,13 +113,29 @@
           <w:rFonts w:ascii="Century Gothic" w:eastAsia="Calibri" w:hAnsi="Century Gothic" w:cs="Times New Roman"/>
           <w:lang w:val="es-CO"/>
         </w:rPr>
-        <w:t>{EmpresaNit}</w:t>
-      </w:r>
+        <w:t>{</w:t>
+      </w:r>
+      <w:proofErr w:type="spellStart"/>
       <w:r>
         <w:rPr>
           <w:rFonts w:ascii="Century Gothic" w:eastAsia="Calibri" w:hAnsi="Century Gothic" w:cs="Times New Roman"/>
           <w:lang w:val="es-CO"/>
         </w:rPr>
+        <w:t>EmpresaNit</w:t>
+      </w:r>
+      <w:proofErr w:type="spellEnd"/>
+      <w:r>
+        <w:rPr>
+          <w:rFonts w:ascii="Century Gothic" w:eastAsia="Calibri" w:hAnsi="Century Gothic" w:cs="Times New Roman"/>
+          <w:lang w:val="es-CO"/>
+        </w:rPr>
+        <w:t>}</w:t>
+      </w:r>
+      <w:r>
+        <w:rPr>
+          <w:rFonts w:ascii="Century Gothic" w:eastAsia="Calibri" w:hAnsi="Century Gothic" w:cs="Times New Roman"/>
+          <w:lang w:val="es-CO"/>
+        </w:rPr>
         <w:t xml:space="preserve">, cuyo domicilio principal se encuentra en </w:t>
       </w:r>
       <w:r>
@@ -79,13 +143,29 @@
           <w:rFonts w:ascii="Century Gothic" w:eastAsia="Calibri" w:hAnsi="Century Gothic" w:cs="Times New Roman"/>
           <w:lang w:val="es-CO"/>
         </w:rPr>
-        <w:t>{EmpresaDomicilio}</w:t>
-      </w:r>
+        <w:t>{</w:t>
+      </w:r>
+      <w:proofErr w:type="spellStart"/>
       <w:r>
         <w:rPr>
           <w:rFonts w:ascii="Century Gothic" w:eastAsia="Calibri" w:hAnsi="Century Gothic" w:cs="Times New Roman"/>
           <w:lang w:val="es-CO"/>
         </w:rPr>
+        <w:t>EmpresaDomicilio</w:t>
+      </w:r>
+      <w:proofErr w:type="spellEnd"/>
+      <w:r>
+        <w:rPr>
+          <w:rFonts w:ascii="Century Gothic" w:eastAsia="Calibri" w:hAnsi="Century Gothic" w:cs="Times New Roman"/>
+          <w:lang w:val="es-CO"/>
+        </w:rPr>
+        <w:t>}</w:t>
+      </w:r>
+      <w:r>
+        <w:rPr>
+          <w:rFonts w:ascii="Century Gothic" w:eastAsia="Calibri" w:hAnsi="Century Gothic" w:cs="Times New Roman"/>
+          <w:lang w:val="es-CO"/>
+        </w:rPr>
         <w:t>, quien para los efectos del presente contrato se denominará EL PROPIETARIO DE LA INFORMACIÓN</w:t>
       </w:r>
       <w:r>
@@ -114,7 +194,23 @@
           <w:rFonts w:ascii="Century Gothic" w:eastAsia="Calibri" w:hAnsi="Century Gothic" w:cs="Times New Roman"/>
           <w:lang w:val="es-CO"/>
         </w:rPr>
-        <w:t>CONTRATANTE, y por otra parte, {ContratistaComparecencia}, quien en adelante se denominará EL RECEPTOR DE LA INFORMACIÓN – CONTRATISTA, han convenido celebrar este Acuerdo de Confidencialidad con el fin de establecer el procedimiento que regirá la custodia y no transmisión a terceros de la información distribuida a EL RECEPTOR DE LA INFORMACIÓN – CONTRATISTA, así como los derechos, responsabilidades y obligaciones inherentes en calidad de receptor de la referida información, previas las siguientes:</w:t>
+        <w:t>CONTRATANTE, y por otra parte, {</w:t>
+      </w:r>
+      <w:proofErr w:type="spellStart"/>
+      <w:r>
+        <w:rPr>
+          <w:rFonts w:ascii="Century Gothic" w:eastAsia="Calibri" w:hAnsi="Century Gothic" w:cs="Times New Roman"/>
+          <w:lang w:val="es-CO"/>
+        </w:rPr>
+        <w:t>ContratistaComparecencia</w:t>
+      </w:r>
+      <w:proofErr w:type="spellEnd"/>
+      <w:r>
+        <w:rPr>
+          <w:rFonts w:ascii="Century Gothic" w:eastAsia="Calibri" w:hAnsi="Century Gothic" w:cs="Times New Roman"/>
+          <w:lang w:val="es-CO"/>
+        </w:rPr>
+        <w:t>}, quien en adelante se denominará EL RECEPTOR DE LA INFORMACIÓN – CONTRATISTA, han convenido celebrar este Acuerdo de Confidencialidad con el fin de establecer el procedimiento que regirá la custodia y no transmisión a terceros de la información distribuida a EL RECEPTOR DE LA INFORMACIÓN – CONTRATISTA, así como los derechos, responsabilidades y obligaciones inherentes en calidad de receptor de la referida información, previas las siguientes:</w:t>
       </w:r>
     </w:p>
     <w:p>
@@ -2233,14 +2329,30 @@
           <w:rFonts w:ascii="Century Gothic" w:hAnsi="Century Gothic"/>
           <w:b/>
         </w:rPr>
-        <w:t xml:space="preserve"> - </w:t>
-      </w:r>
+        <w:t xml:space="preserve"> </w:t>
+      </w:r>
+      <w:proofErr w:type="gramStart"/>
       <w:r>
         <w:rPr>
           <w:rFonts w:ascii="Century Gothic" w:hAnsi="Century Gothic"/>
           <w:b/>
         </w:rPr>
-        <w:t xml:space="preserve"> REQUERIMIENTOS POR AUTORIDADES JUDICIALES O ADMINISTRATIVAS.</w:t>
+        <w:t xml:space="preserve">- </w:t>
+      </w:r>
+      <w:r>
+        <w:rPr>
+          <w:rFonts w:ascii="Century Gothic" w:hAnsi="Century Gothic"/>
+          <w:b/>
+        </w:rPr>
+        <w:t xml:space="preserve"> REQUERIMIENTOS</w:t>
+      </w:r>
+      <w:proofErr w:type="gramEnd"/>
+      <w:r>
+        <w:rPr>
+          <w:rFonts w:ascii="Century Gothic" w:hAnsi="Century Gothic"/>
+          <w:b/>
+        </w:rPr>
+        <w:t xml:space="preserve"> POR AUTORIDADES JUDICIALES O ADMINISTRATIVAS.</w:t>
       </w:r>
       <w:r>
         <w:rPr>
@@ -2519,21 +2631,59 @@
         <w:rPr>
           <w:rFonts w:ascii="Century Gothic" w:hAnsi="Century Gothic" w:cs="Arial"/>
           <w:b/>
-        </w:rPr>
-        <w:t>{FechaInicioDia}</w:t>
-      </w:r>
-      <w:r>
-        <w:rPr>
-          <w:rFonts w:ascii="Century Gothic" w:hAnsi="Century Gothic"/>
-        </w:rPr>
-        <w:t xml:space="preserve"> del mes de </w:t>
-      </w:r>
+          <w:lang w:val="es-419"/>
+        </w:rPr>
+        <w:t>{{</w:t>
+      </w:r>
+      <w:proofErr w:type="spellStart"/>
       <w:r>
         <w:rPr>
           <w:rFonts w:ascii="Century Gothic" w:hAnsi="Century Gothic" w:cs="Arial"/>
           <w:b/>
-        </w:rPr>
-        <w:t>{FechaInicioMesTexto}</w:t>
+          <w:lang w:val="es-419"/>
+        </w:rPr>
+        <w:t>FechaInicioDia</w:t>
+      </w:r>
+      <w:proofErr w:type="spellEnd"/>
+      <w:r>
+        <w:rPr>
+          <w:rFonts w:ascii="Century Gothic" w:hAnsi="Century Gothic" w:cs="Arial"/>
+          <w:b/>
+          <w:lang w:val="es-419"/>
+        </w:rPr>
+        <w:t>}}</w:t>
+      </w:r>
+      <w:r>
+        <w:rPr>
+          <w:rFonts w:ascii="Century Gothic" w:hAnsi="Century Gothic"/>
+        </w:rPr>
+        <w:t xml:space="preserve"> del mes de </w:t>
+      </w:r>
+      <w:r>
+        <w:rPr>
+          <w:rFonts w:ascii="Century Gothic" w:hAnsi="Century Gothic" w:cs="Arial"/>
+          <w:b/>
+          <w:lang w:val="es-419"/>
+        </w:rPr>
+        <w:t>{{</w:t>
+      </w:r>
+      <w:proofErr w:type="spellStart"/>
+      <w:r>
+        <w:rPr>
+          <w:rFonts w:ascii="Century Gothic" w:hAnsi="Century Gothic" w:cs="Arial"/>
+          <w:b/>
+          <w:lang w:val="es-419"/>
+        </w:rPr>
+        <w:t>FechaInicioMesTexto</w:t>
+      </w:r>
+      <w:proofErr w:type="spellEnd"/>
+      <w:r>
+        <w:rPr>
+          <w:rFonts w:ascii="Century Gothic" w:hAnsi="Century Gothic" w:cs="Arial"/>
+          <w:b/>
+          <w:lang w:val="es-419"/>
+        </w:rPr>
+        <w:t>}}</w:t>
       </w:r>
       <w:r>
         <w:rPr>
@@ -2545,7 +2695,21 @@
         <w:rPr>
           <w:rFonts w:ascii="Century Gothic" w:hAnsi="Century Gothic"/>
         </w:rPr>
-        <w:t>{FechaInicioAnio}</w:t>
+        <w:t>{</w:t>
+      </w:r>
+      <w:proofErr w:type="spellStart"/>
+      <w:r>
+        <w:rPr>
+          <w:rFonts w:ascii="Century Gothic" w:hAnsi="Century Gothic"/>
+        </w:rPr>
+        <w:t>FechaInicioAnio</w:t>
+      </w:r>
+      <w:proofErr w:type="spellEnd"/>
+      <w:r>
+        <w:rPr>
+          <w:rFonts w:ascii="Century Gothic" w:hAnsi="Century Gothic"/>
+        </w:rPr>
+        <w:t>}</w:t>
       </w:r>
       <w:r>
         <w:rPr>
@@ -2596,8 +2760,8 @@
         <w:tblLook w:val="04A0" w:firstRow="1" w:lastRow="0" w:firstColumn="1" w:lastColumn="0" w:noHBand="0" w:noVBand="1"/>
       </w:tblPr>
       <w:tblGrid>
-        <w:gridCol w:w="4684"/>
-        <w:gridCol w:w="3820"/>
+        <w:gridCol w:w="4820"/>
+        <w:gridCol w:w="3674"/>
       </w:tblGrid>
       <w:tr>
         <w:tc>
@@ -2700,7 +2864,27 @@
                 <w:sz w:val="22"/>
                 <w:szCs w:val="22"/>
               </w:rPr>
-              <w:t>{EmpresaRepresentanteLegal}</w:t>
+              <w:t>{{</w:t>
+            </w:r>
+            <w:proofErr w:type="spellStart"/>
+            <w:r>
+              <w:rPr>
+                <w:rFonts w:ascii="Century Gothic" w:hAnsi="Century Gothic" w:cs="Arial"/>
+                <w:b/>
+                <w:sz w:val="22"/>
+                <w:szCs w:val="22"/>
+              </w:rPr>
+              <w:t>EmpresaRepresentanteLegal</w:t>
+            </w:r>
+            <w:proofErr w:type="spellEnd"/>
+            <w:r>
+              <w:rPr>
+                <w:rFonts w:ascii="Century Gothic" w:hAnsi="Century Gothic" w:cs="Arial"/>
+                <w:b/>
+                <w:sz w:val="22"/>
+                <w:szCs w:val="22"/>
+              </w:rPr>
+              <w:t xml:space="preserve">}} </w:t>
             </w:r>
           </w:p>
           <w:p>
@@ -2721,8 +2905,9 @@
                 <w:sz w:val="22"/>
                 <w:szCs w:val="22"/>
               </w:rPr>
-              <w:t xml:space="preserve">C.C. </w:t>
+              <w:t>C.C. {{</w:t>
             </w:r>
+            <w:proofErr w:type="spellStart"/>
             <w:r>
               <w:rPr>
                 <w:rFonts w:ascii="Century Gothic" w:hAnsi="Century Gothic" w:cs="Arial"/>
@@ -2730,7 +2915,17 @@
                 <w:sz w:val="22"/>
                 <w:szCs w:val="22"/>
               </w:rPr>
-              <w:t>{EmpresaCedulaRepresentante}</w:t>
+              <w:t>EmpresaCedulaRepresentante</w:t>
+            </w:r>
+            <w:proofErr w:type="spellEnd"/>
+            <w:r>
+              <w:rPr>
+                <w:rFonts w:ascii="Century Gothic" w:hAnsi="Century Gothic" w:cs="Arial"/>
+                <w:b/>
+                <w:sz w:val="22"/>
+                <w:szCs w:val="22"/>
+              </w:rPr>
+              <w:t xml:space="preserve">}} </w:t>
             </w:r>
           </w:p>
           <w:p>
@@ -2751,7 +2946,7 @@
                 <w:sz w:val="22"/>
                 <w:szCs w:val="22"/>
               </w:rPr>
-              <w:t>Representante Legal</w:t>
+              <w:t xml:space="preserve">Representante Legal </w:t>
             </w:r>
           </w:p>
           <w:p>
@@ -2772,7 +2967,27 @@
                 <w:sz w:val="22"/>
                 <w:szCs w:val="22"/>
               </w:rPr>
-              <w:t>{EmpresaRazonSocial}</w:t>
+              <w:t>{{</w:t>
+            </w:r>
+            <w:proofErr w:type="spellStart"/>
+            <w:r>
+              <w:rPr>
+                <w:rFonts w:ascii="Century Gothic" w:hAnsi="Century Gothic" w:cs="Arial"/>
+                <w:b/>
+                <w:sz w:val="22"/>
+                <w:szCs w:val="22"/>
+              </w:rPr>
+              <w:t>EmpresaRazonSocial</w:t>
+            </w:r>
+            <w:proofErr w:type="spellEnd"/>
+            <w:r>
+              <w:rPr>
+                <w:rFonts w:ascii="Century Gothic" w:hAnsi="Century Gothic" w:cs="Arial"/>
+                <w:b/>
+                <w:sz w:val="22"/>
+                <w:szCs w:val="22"/>
+              </w:rPr>
+              <w:t xml:space="preserve">}} </w:t>
             </w:r>
           </w:p>
           <w:p>
@@ -2780,7 +2995,7 @@
               <w:spacing w:line="276" w:lineRule="auto"/>
               <w:jc w:val="both"/>
               <w:rPr>
-                <w:rFonts w:ascii="Century Gothic" w:hAnsi="Century Gothic" w:cs="Segoe UI"/>
+                <w:rFonts w:ascii="Century Gothic" w:hAnsi="Century Gothic" w:cs="Arial"/>
                 <w:b/>
                 <w:sz w:val="22"/>
                 <w:szCs w:val="22"/>
@@ -2793,8 +3008,9 @@
                 <w:sz w:val="22"/>
                 <w:szCs w:val="22"/>
               </w:rPr>
-              <w:t xml:space="preserve">NIT. </w:t>
+              <w:t>NIT. {{</w:t>
             </w:r>
+            <w:proofErr w:type="spellStart"/>
             <w:r>
               <w:rPr>
                 <w:rFonts w:ascii="Century Gothic" w:hAnsi="Century Gothic" w:cs="Arial"/>
@@ -2802,8 +3018,30 @@
                 <w:sz w:val="22"/>
                 <w:szCs w:val="22"/>
               </w:rPr>
-              <w:t>{EmpresaDomicilio}</w:t>
+              <w:t>EmpresaNit</w:t>
             </w:r>
+            <w:proofErr w:type="spellEnd"/>
+            <w:r>
+              <w:rPr>
+                <w:rFonts w:ascii="Century Gothic" w:hAnsi="Century Gothic" w:cs="Arial"/>
+                <w:b/>
+                <w:sz w:val="22"/>
+                <w:szCs w:val="22"/>
+              </w:rPr>
+              <w:t>}}</w:t>
+            </w:r>
+          </w:p>
+          <w:p>
+            <w:pPr>
+              <w:spacing w:line="276" w:lineRule="auto"/>
+              <w:jc w:val="both"/>
+              <w:rPr>
+                <w:rFonts w:ascii="Century Gothic" w:hAnsi="Century Gothic" w:cs="Segoe UI"/>
+                <w:b/>
+                <w:sz w:val="22"/>
+                <w:szCs w:val="22"/>
+              </w:rPr>
+            </w:pPr>
           </w:p>
         </w:tc>
         <w:tc>
@@ -2903,7 +3141,27 @@
                 <w:sz w:val="22"/>
                 <w:szCs w:val="22"/>
               </w:rPr>
-              <w:t>{ContratistaFirmaNombre}</w:t>
+              <w:t>{{</w:t>
+            </w:r>
+            <w:proofErr w:type="spellStart"/>
+            <w:r>
+              <w:rPr>
+                <w:rFonts w:ascii="Century Gothic" w:hAnsi="Century Gothic" w:cs="Arial"/>
+                <w:b/>
+                <w:sz w:val="22"/>
+                <w:szCs w:val="22"/>
+              </w:rPr>
+              <w:t>ContratistaFirmaNombre</w:t>
+            </w:r>
+            <w:proofErr w:type="spellEnd"/>
+            <w:r>
+              <w:rPr>
+                <w:rFonts w:ascii="Century Gothic" w:hAnsi="Century Gothic" w:cs="Arial"/>
+                <w:b/>
+                <w:sz w:val="22"/>
+                <w:szCs w:val="22"/>
+              </w:rPr>
+              <w:t xml:space="preserve">}} </w:t>
             </w:r>
           </w:p>
           <w:p>
@@ -2924,8 +3182,9 @@
                 <w:sz w:val="22"/>
                 <w:szCs w:val="22"/>
               </w:rPr>
-              <w:t>C.C.</w:t>
+              <w:t>C.C. {{</w:t>
             </w:r>
+            <w:proofErr w:type="spellStart"/>
             <w:r>
               <w:rPr>
                 <w:rFonts w:ascii="Century Gothic" w:hAnsi="Century Gothic" w:cs="Arial"/>
@@ -2933,7 +3192,17 @@
                 <w:sz w:val="22"/>
                 <w:szCs w:val="22"/>
               </w:rPr>
-              <w:t>{ContratistaFirmaDocumento}</w:t>
+              <w:t>ContratistaFirmaDocumento</w:t>
+            </w:r>
+            <w:proofErr w:type="spellEnd"/>
+            <w:r>
+              <w:rPr>
+                <w:rFonts w:ascii="Century Gothic" w:hAnsi="Century Gothic" w:cs="Arial"/>
+                <w:b/>
+                <w:sz w:val="22"/>
+                <w:szCs w:val="22"/>
+              </w:rPr>
+              <w:t xml:space="preserve">}} </w:t>
             </w:r>
           </w:p>
           <w:p>
@@ -2954,7 +3223,27 @@
                 <w:sz w:val="22"/>
                 <w:szCs w:val="22"/>
               </w:rPr>
-              <w:t>{ContratistaFirmaCargo}</w:t>
+              <w:t>{{</w:t>
+            </w:r>
+            <w:proofErr w:type="spellStart"/>
+            <w:r>
+              <w:rPr>
+                <w:rFonts w:ascii="Century Gothic" w:hAnsi="Century Gothic" w:cs="Arial"/>
+                <w:b/>
+                <w:sz w:val="22"/>
+                <w:szCs w:val="22"/>
+              </w:rPr>
+              <w:t>ContratistaFirmaCargo</w:t>
+            </w:r>
+            <w:proofErr w:type="spellEnd"/>
+            <w:r>
+              <w:rPr>
+                <w:rFonts w:ascii="Century Gothic" w:hAnsi="Century Gothic" w:cs="Arial"/>
+                <w:b/>
+                <w:sz w:val="22"/>
+                <w:szCs w:val="22"/>
+              </w:rPr>
+              <w:t xml:space="preserve">}} </w:t>
             </w:r>
           </w:p>
           <w:p>
@@ -2975,8 +3264,9 @@
                 <w:sz w:val="22"/>
                 <w:szCs w:val="22"/>
               </w:rPr>
-              <w:t xml:space="preserve">NIT. </w:t>
+              <w:t>NIT. {{</w:t>
             </w:r>
+            <w:proofErr w:type="spellStart"/>
             <w:r>
               <w:rPr>
                 <w:rFonts w:ascii="Century Gothic" w:hAnsi="Century Gothic" w:cs="Arial"/>
@@ -2984,7 +3274,17 @@
                 <w:sz w:val="22"/>
                 <w:szCs w:val="22"/>
               </w:rPr>
-              <w:t>{ContratistaFirmaNit}</w:t>
+              <w:t>ContratistaFirmaNit</w:t>
+            </w:r>
+            <w:proofErr w:type="spellEnd"/>
+            <w:r>
+              <w:rPr>
+                <w:rFonts w:ascii="Century Gothic" w:hAnsi="Century Gothic" w:cs="Arial"/>
+                <w:b/>
+                <w:sz w:val="22"/>
+                <w:szCs w:val="22"/>
+              </w:rPr>
+              <w:t>}}</w:t>
             </w:r>
           </w:p>
           <w:p>
@@ -5121,6 +5421,30 @@
 </file>
 
 <file path=customXml/item1.xml><?xml version="1.0" encoding="utf-8"?>
+<p:properties xmlns:p="http://schemas.microsoft.com/office/2006/metadata/properties" xmlns:xsi="http://www.w3.org/2001/XMLSchema-instance" xmlns:pc="http://schemas.microsoft.com/office/infopath/2007/PartnerControls">
+  <documentManagement>
+    <lcf76f155ced4ddcb4097134ff3c332f xmlns="0671de82-fb77-4741-a946-bbedde5d4f76">
+      <Terms xmlns="http://schemas.microsoft.com/office/infopath/2007/PartnerControls"/>
+    </lcf76f155ced4ddcb4097134ff3c332f>
+    <TaxCatchAll xmlns="bfe36008-4467-4f6a-b17f-684c3d9d556d" xsi:nil="true"/>
+  </documentManagement>
+</p:properties>
+</file>
+
+<file path=customXml/item2.xml><?xml version="1.0" encoding="utf-8"?>
+<b:Sources xmlns:b="http://schemas.openxmlformats.org/officeDocument/2006/bibliography" xmlns="http://schemas.openxmlformats.org/officeDocument/2006/bibliography" SelectedStyle="\APASixthEditionOfficeOnline.xsl" StyleName="APA" Version="6"/>
+</file>
+
+<file path=customXml/item3.xml><?xml version="1.0" encoding="utf-8"?>
+<?mso-contentType ?>
+<FormTemplates xmlns="http://schemas.microsoft.com/sharepoint/v3/contenttype/forms">
+  <Display>DocumentLibraryForm</Display>
+  <Edit>DocumentLibraryForm</Edit>
+  <New>DocumentLibraryForm</New>
+</FormTemplates>
+</file>
+
+<file path=customXml/item4.xml><?xml version="1.0" encoding="utf-8"?>
 <ct:contentTypeSchema xmlns:ct="http://schemas.microsoft.com/office/2006/metadata/contentType" xmlns:ma="http://schemas.microsoft.com/office/2006/metadata/properties/metaAttributes" ct:_="" ma:_="" ma:contentTypeName="Documento" ma:contentTypeID="0x01010068C79E2D4FBF494D8565142F1B408D23" ma:contentTypeVersion="13" ma:contentTypeDescription="Crear nuevo documento." ma:contentTypeScope="" ma:versionID="033ef99cf88c0d3b788bf7a31a0475d4">
   <xsd:schema xmlns:xsd="http://www.w3.org/2001/XMLSchema" xmlns:xs="http://www.w3.org/2001/XMLSchema" xmlns:p="http://schemas.microsoft.com/office/2006/metadata/properties" xmlns:ns2="0671de82-fb77-4741-a946-bbedde5d4f76" xmlns:ns3="bfe36008-4467-4f6a-b17f-684c3d9d556d" targetNamespace="http://schemas.microsoft.com/office/2006/metadata/properties" ma:root="true" ma:fieldsID="67b2ee94343aeb2f8f0920204dca2d30" ns2:_="" ns3:_="">
     <xsd:import namespace="0671de82-fb77-4741-a946-bbedde5d4f76"/>
@@ -5327,31 +5651,34 @@
 </ct:contentTypeSchema>
 </file>
 
-<file path=customXml/item2.xml><?xml version="1.0" encoding="utf-8"?>
-<?mso-contentType ?>
-<FormTemplates xmlns="http://schemas.microsoft.com/sharepoint/v3/contenttype/forms">
-  <Display>DocumentLibraryForm</Display>
-  <Edit>DocumentLibraryForm</Edit>
-  <New>DocumentLibraryForm</New>
-</FormTemplates>
+<file path=customXml/itemProps1.xml><?xml version="1.0" encoding="utf-8"?>
+<ds:datastoreItem xmlns:ds="http://schemas.openxmlformats.org/officeDocument/2006/customXml" ds:itemID="{41AEA7D2-D02A-4A22-8DB0-806C047780AB}">
+  <ds:schemaRefs>
+    <ds:schemaRef ds:uri="http://schemas.microsoft.com/office/2006/metadata/properties"/>
+    <ds:schemaRef ds:uri="http://schemas.microsoft.com/office/infopath/2007/PartnerControls"/>
+    <ds:schemaRef ds:uri="0671de82-fb77-4741-a946-bbedde5d4f76"/>
+    <ds:schemaRef ds:uri="bfe36008-4467-4f6a-b17f-684c3d9d556d"/>
+  </ds:schemaRefs>
+</ds:datastoreItem>
 </file>
 
-<file path=customXml/item3.xml><?xml version="1.0" encoding="utf-8"?>
-<b:Sources xmlns:b="http://schemas.openxmlformats.org/officeDocument/2006/bibliography" xmlns="http://schemas.openxmlformats.org/officeDocument/2006/bibliography" SelectedStyle="\APASixthEditionOfficeOnline.xsl" StyleName="APA" Version="6"/>
+<file path=customXml/itemProps2.xml><?xml version="1.0" encoding="utf-8"?>
+<ds:datastoreItem xmlns:ds="http://schemas.openxmlformats.org/officeDocument/2006/customXml" ds:itemID="{EDDE749B-1ED2-4CFC-B407-B3EDC88F0351}">
+  <ds:schemaRefs>
+    <ds:schemaRef ds:uri="http://schemas.openxmlformats.org/officeDocument/2006/bibliography"/>
+  </ds:schemaRefs>
+</ds:datastoreItem>
 </file>
 
-<file path=customXml/item4.xml><?xml version="1.0" encoding="utf-8"?>
-<p:properties xmlns:p="http://schemas.microsoft.com/office/2006/metadata/properties" xmlns:xsi="http://www.w3.org/2001/XMLSchema-instance" xmlns:pc="http://schemas.microsoft.com/office/infopath/2007/PartnerControls">
-  <documentManagement>
-    <lcf76f155ced4ddcb4097134ff3c332f xmlns="0671de82-fb77-4741-a946-bbedde5d4f76">
-      <Terms xmlns="http://schemas.microsoft.com/office/infopath/2007/PartnerControls"/>
-    </lcf76f155ced4ddcb4097134ff3c332f>
-    <TaxCatchAll xmlns="bfe36008-4467-4f6a-b17f-684c3d9d556d" xsi:nil="true"/>
-  </documentManagement>
-</p:properties>
+<file path=customXml/itemProps3.xml><?xml version="1.0" encoding="utf-8"?>
+<ds:datastoreItem xmlns:ds="http://schemas.openxmlformats.org/officeDocument/2006/customXml" ds:itemID="{3F384A7A-5473-42CA-8DD9-691BEF5CE007}">
+  <ds:schemaRefs>
+    <ds:schemaRef ds:uri="http://schemas.microsoft.com/sharepoint/v3/contenttype/forms"/>
+  </ds:schemaRefs>
+</ds:datastoreItem>
 </file>
 
-<file path=customXml/itemProps1.xml><?xml version="1.0" encoding="utf-8"?>
+<file path=customXml/itemProps4.xml><?xml version="1.0" encoding="utf-8"?>
 <ds:datastoreItem xmlns:ds="http://schemas.openxmlformats.org/officeDocument/2006/customXml" ds:itemID="{B4204128-4410-4A8B-ADA6-9DCFD22B6495}">
   <ds:schemaRefs>
     <ds:schemaRef ds:uri="http://schemas.microsoft.com/office/2006/metadata/contentType"/>
@@ -5368,31 +5695,4 @@
     <ds:schemaRef ds:uri="http://schemas.microsoft.com/internal/obd"/>
   </ds:schemaRefs>
 </ds:datastoreItem>
-</file>
-
-<file path=customXml/itemProps2.xml><?xml version="1.0" encoding="utf-8"?>
-<ds:datastoreItem xmlns:ds="http://schemas.openxmlformats.org/officeDocument/2006/customXml" ds:itemID="{3F384A7A-5473-42CA-8DD9-691BEF5CE007}">
-  <ds:schemaRefs>
-    <ds:schemaRef ds:uri="http://schemas.microsoft.com/sharepoint/v3/contenttype/forms"/>
-  </ds:schemaRefs>
-</ds:datastoreItem>
-</file>
-
-<file path=customXml/itemProps3.xml><?xml version="1.0" encoding="utf-8"?>
-<ds:datastoreItem xmlns:ds="http://schemas.openxmlformats.org/officeDocument/2006/customXml" ds:itemID="{EDDE749B-1ED2-4CFC-B407-B3EDC88F0351}">
-  <ds:schemaRefs>
-    <ds:schemaRef ds:uri="http://schemas.openxmlformats.org/officeDocument/2006/bibliography"/>
-  </ds:schemaRefs>
-</ds:datastoreItem>
-</file>
-
-<file path=customXml/itemProps4.xml><?xml version="1.0" encoding="utf-8"?>
-<ds:datastoreItem xmlns:ds="http://schemas.openxmlformats.org/officeDocument/2006/customXml" ds:itemID="{41AEA7D2-D02A-4A22-8DB0-806C047780AB}">
-  <ds:schemaRefs>
-    <ds:schemaRef ds:uri="http://schemas.microsoft.com/office/2006/metadata/properties"/>
-    <ds:schemaRef ds:uri="http://schemas.microsoft.com/office/infopath/2007/PartnerControls"/>
-    <ds:schemaRef ds:uri="0671de82-fb77-4741-a946-bbedde5d4f76"/>
-    <ds:schemaRef ds:uri="bfe36008-4467-4f6a-b17f-684c3d9d556d"/>
-  </ds:schemaRefs>
-</ds:datastoreItem>
 </file>
</xml_diff>

<commit_message>
Se organizan los documentos de tal manera que concuerde con las etiquetas que ya tenemos
</commit_message>
<xml_diff>
--- a/back/src/static/contratos/AcuerdoConfidencialdiadCapital.docx
+++ b/back/src/static/contratos/AcuerdoConfidencialdiadCapital.docx
@@ -23,13 +23,43 @@
           <w:rFonts w:ascii="Century Gothic" w:eastAsia="Calibri" w:hAnsi="Century Gothic" w:cs="Times New Roman"/>
           <w:lang w:val="es-CO"/>
         </w:rPr>
-        <w:t>{EmpresaRepresentanteLegal}</w:t>
+        <w:t>{</w:t>
       </w:r>
       <w:r>
         <w:rPr>
           <w:rFonts w:ascii="Century Gothic" w:eastAsia="Calibri" w:hAnsi="Century Gothic" w:cs="Times New Roman"/>
           <w:lang w:val="es-CO"/>
         </w:rPr>
+        <w:t>{</w:t>
+      </w:r>
+      <w:proofErr w:type="spellStart"/>
+      <w:r>
+        <w:rPr>
+          <w:rFonts w:ascii="Century Gothic" w:eastAsia="Calibri" w:hAnsi="Century Gothic" w:cs="Times New Roman"/>
+          <w:lang w:val="es-CO"/>
+        </w:rPr>
+        <w:t>EmpresaRepresentanteLegal</w:t>
+      </w:r>
+      <w:proofErr w:type="spellEnd"/>
+      <w:r>
+        <w:rPr>
+          <w:rFonts w:ascii="Century Gothic" w:eastAsia="Calibri" w:hAnsi="Century Gothic" w:cs="Times New Roman"/>
+          <w:lang w:val="es-CO"/>
+        </w:rPr>
+        <w:t>}</w:t>
+      </w:r>
+      <w:r>
+        <w:rPr>
+          <w:rFonts w:ascii="Century Gothic" w:eastAsia="Calibri" w:hAnsi="Century Gothic" w:cs="Times New Roman"/>
+          <w:lang w:val="es-CO"/>
+        </w:rPr>
+        <w:t>}</w:t>
+      </w:r>
+      <w:r>
+        <w:rPr>
+          <w:rFonts w:ascii="Century Gothic" w:eastAsia="Calibri" w:hAnsi="Century Gothic" w:cs="Times New Roman"/>
+          <w:lang w:val="es-CO"/>
+        </w:rPr>
         <w:t xml:space="preserve">, mayor de edad, identificada con C.C. </w:t>
       </w:r>
       <w:r>
@@ -37,13 +67,43 @@
           <w:rFonts w:ascii="Century Gothic" w:eastAsia="Calibri" w:hAnsi="Century Gothic" w:cs="Times New Roman"/>
           <w:lang w:val="es-CO"/>
         </w:rPr>
-        <w:t>{EmpresaCedulaRepresentante}</w:t>
+        <w:t>{</w:t>
       </w:r>
       <w:r>
         <w:rPr>
           <w:rFonts w:ascii="Century Gothic" w:eastAsia="Calibri" w:hAnsi="Century Gothic" w:cs="Times New Roman"/>
           <w:lang w:val="es-CO"/>
         </w:rPr>
+        <w:t>{</w:t>
+      </w:r>
+      <w:proofErr w:type="spellStart"/>
+      <w:r>
+        <w:rPr>
+          <w:rFonts w:ascii="Century Gothic" w:eastAsia="Calibri" w:hAnsi="Century Gothic" w:cs="Times New Roman"/>
+          <w:lang w:val="es-CO"/>
+        </w:rPr>
+        <w:t>EmpresaCedulaRepresentante</w:t>
+      </w:r>
+      <w:proofErr w:type="spellEnd"/>
+      <w:r>
+        <w:rPr>
+          <w:rFonts w:ascii="Century Gothic" w:eastAsia="Calibri" w:hAnsi="Century Gothic" w:cs="Times New Roman"/>
+          <w:lang w:val="es-CO"/>
+        </w:rPr>
+        <w:t>}</w:t>
+      </w:r>
+      <w:r>
+        <w:rPr>
+          <w:rFonts w:ascii="Century Gothic" w:eastAsia="Calibri" w:hAnsi="Century Gothic" w:cs="Times New Roman"/>
+          <w:lang w:val="es-CO"/>
+        </w:rPr>
+        <w:t>}</w:t>
+      </w:r>
+      <w:r>
+        <w:rPr>
+          <w:rFonts w:ascii="Century Gothic" w:eastAsia="Calibri" w:hAnsi="Century Gothic" w:cs="Times New Roman"/>
+          <w:lang w:val="es-CO"/>
+        </w:rPr>
         <w:t xml:space="preserve">, obrando en su calidad de Representante Legal de </w:t>
       </w:r>
       <w:r>
@@ -51,13 +111,43 @@
           <w:rFonts w:ascii="Century Gothic" w:eastAsia="Calibri" w:hAnsi="Century Gothic" w:cs="Times New Roman"/>
           <w:lang w:val="es-CO"/>
         </w:rPr>
-        <w:t>{EmpresaRazonSocial}</w:t>
+        <w:t>{</w:t>
       </w:r>
       <w:r>
         <w:rPr>
           <w:rFonts w:ascii="Century Gothic" w:eastAsia="Calibri" w:hAnsi="Century Gothic" w:cs="Times New Roman"/>
           <w:lang w:val="es-CO"/>
         </w:rPr>
+        <w:t>{</w:t>
+      </w:r>
+      <w:proofErr w:type="spellStart"/>
+      <w:r>
+        <w:rPr>
+          <w:rFonts w:ascii="Century Gothic" w:eastAsia="Calibri" w:hAnsi="Century Gothic" w:cs="Times New Roman"/>
+          <w:lang w:val="es-CO"/>
+        </w:rPr>
+        <w:t>EmpresaRazonSocial</w:t>
+      </w:r>
+      <w:proofErr w:type="spellEnd"/>
+      <w:r>
+        <w:rPr>
+          <w:rFonts w:ascii="Century Gothic" w:eastAsia="Calibri" w:hAnsi="Century Gothic" w:cs="Times New Roman"/>
+          <w:lang w:val="es-CO"/>
+        </w:rPr>
+        <w:t>}</w:t>
+      </w:r>
+      <w:r>
+        <w:rPr>
+          <w:rFonts w:ascii="Century Gothic" w:eastAsia="Calibri" w:hAnsi="Century Gothic" w:cs="Times New Roman"/>
+          <w:lang w:val="es-CO"/>
+        </w:rPr>
+        <w:t>}</w:t>
+      </w:r>
+      <w:r>
+        <w:rPr>
+          <w:rFonts w:ascii="Century Gothic" w:eastAsia="Calibri" w:hAnsi="Century Gothic" w:cs="Times New Roman"/>
+          <w:lang w:val="es-CO"/>
+        </w:rPr>
         <w:t xml:space="preserve">., persona jurídica identificada con NIT </w:t>
       </w:r>
       <w:r>
@@ -65,13 +155,43 @@
           <w:rFonts w:ascii="Century Gothic" w:eastAsia="Calibri" w:hAnsi="Century Gothic" w:cs="Times New Roman"/>
           <w:lang w:val="es-CO"/>
         </w:rPr>
-        <w:t>{EmpresaNit}</w:t>
+        <w:t>{</w:t>
       </w:r>
       <w:r>
         <w:rPr>
           <w:rFonts w:ascii="Century Gothic" w:eastAsia="Calibri" w:hAnsi="Century Gothic" w:cs="Times New Roman"/>
           <w:lang w:val="es-CO"/>
         </w:rPr>
+        <w:t>{</w:t>
+      </w:r>
+      <w:proofErr w:type="spellStart"/>
+      <w:r>
+        <w:rPr>
+          <w:rFonts w:ascii="Century Gothic" w:eastAsia="Calibri" w:hAnsi="Century Gothic" w:cs="Times New Roman"/>
+          <w:lang w:val="es-CO"/>
+        </w:rPr>
+        <w:t>EmpresaNit</w:t>
+      </w:r>
+      <w:proofErr w:type="spellEnd"/>
+      <w:r>
+        <w:rPr>
+          <w:rFonts w:ascii="Century Gothic" w:eastAsia="Calibri" w:hAnsi="Century Gothic" w:cs="Times New Roman"/>
+          <w:lang w:val="es-CO"/>
+        </w:rPr>
+        <w:t>}</w:t>
+      </w:r>
+      <w:r>
+        <w:rPr>
+          <w:rFonts w:ascii="Century Gothic" w:eastAsia="Calibri" w:hAnsi="Century Gothic" w:cs="Times New Roman"/>
+          <w:lang w:val="es-CO"/>
+        </w:rPr>
+        <w:t>}</w:t>
+      </w:r>
+      <w:r>
+        <w:rPr>
+          <w:rFonts w:ascii="Century Gothic" w:eastAsia="Calibri" w:hAnsi="Century Gothic" w:cs="Times New Roman"/>
+          <w:lang w:val="es-CO"/>
+        </w:rPr>
         <w:t xml:space="preserve">, cuyo domicilio principal se encuentra en </w:t>
       </w:r>
       <w:r>
@@ -79,13 +199,43 @@
           <w:rFonts w:ascii="Century Gothic" w:eastAsia="Calibri" w:hAnsi="Century Gothic" w:cs="Times New Roman"/>
           <w:lang w:val="es-CO"/>
         </w:rPr>
-        <w:t>{EmpresaDomicilio}</w:t>
+        <w:t>{</w:t>
       </w:r>
       <w:r>
         <w:rPr>
           <w:rFonts w:ascii="Century Gothic" w:eastAsia="Calibri" w:hAnsi="Century Gothic" w:cs="Times New Roman"/>
           <w:lang w:val="es-CO"/>
         </w:rPr>
+        <w:t>{</w:t>
+      </w:r>
+      <w:proofErr w:type="spellStart"/>
+      <w:r>
+        <w:rPr>
+          <w:rFonts w:ascii="Century Gothic" w:eastAsia="Calibri" w:hAnsi="Century Gothic" w:cs="Times New Roman"/>
+          <w:lang w:val="es-CO"/>
+        </w:rPr>
+        <w:t>EmpresaDomicilio</w:t>
+      </w:r>
+      <w:proofErr w:type="spellEnd"/>
+      <w:r>
+        <w:rPr>
+          <w:rFonts w:ascii="Century Gothic" w:eastAsia="Calibri" w:hAnsi="Century Gothic" w:cs="Times New Roman"/>
+          <w:lang w:val="es-CO"/>
+        </w:rPr>
+        <w:t>}</w:t>
+      </w:r>
+      <w:r>
+        <w:rPr>
+          <w:rFonts w:ascii="Century Gothic" w:eastAsia="Calibri" w:hAnsi="Century Gothic" w:cs="Times New Roman"/>
+          <w:lang w:val="es-CO"/>
+        </w:rPr>
+        <w:t>}</w:t>
+      </w:r>
+      <w:r>
+        <w:rPr>
+          <w:rFonts w:ascii="Century Gothic" w:eastAsia="Calibri" w:hAnsi="Century Gothic" w:cs="Times New Roman"/>
+          <w:lang w:val="es-CO"/>
+        </w:rPr>
         <w:t>, quien para los efectos del presente contrato se denominará EL PROPIETARIO DE LA INFORMACIÓN</w:t>
       </w:r>
       <w:r>
@@ -114,7 +264,51 @@
           <w:rFonts w:ascii="Century Gothic" w:eastAsia="Calibri" w:hAnsi="Century Gothic" w:cs="Times New Roman"/>
           <w:lang w:val="es-CO"/>
         </w:rPr>
-        <w:t>CONTRATANTE, y por otra parte, {ContratistaComparecencia}, quien en adelante se denominará EL RECEPTOR DE LA INFORMACIÓN – CONTRATISTA, han convenido celebrar este Acuerdo de Confidencialidad con el fin de establecer el procedimiento que regirá la custodia y no transmisión a terceros de la información distribuida a EL RECEPTOR DE LA INFORMACIÓN – CONTRATISTA, así como los derechos, responsabilidades y obligaciones inherentes en calidad de receptor de la referida información, previas las siguientes:</w:t>
+        <w:t xml:space="preserve">CONTRATANTE, y por otra parte, </w:t>
+      </w:r>
+      <w:r>
+        <w:rPr>
+          <w:rFonts w:ascii="Century Gothic" w:eastAsia="Calibri" w:hAnsi="Century Gothic" w:cs="Times New Roman"/>
+          <w:lang w:val="es-CO"/>
+        </w:rPr>
+        <w:t>{</w:t>
+      </w:r>
+      <w:r>
+        <w:rPr>
+          <w:rFonts w:ascii="Century Gothic" w:eastAsia="Calibri" w:hAnsi="Century Gothic" w:cs="Times New Roman"/>
+          <w:lang w:val="es-CO"/>
+        </w:rPr>
+        <w:t>{</w:t>
+      </w:r>
+      <w:proofErr w:type="spellStart"/>
+      <w:r>
+        <w:rPr>
+          <w:rFonts w:ascii="Century Gothic" w:eastAsia="Calibri" w:hAnsi="Century Gothic" w:cs="Times New Roman"/>
+          <w:lang w:val="es-CO"/>
+        </w:rPr>
+        <w:t>ContratistaComparecencia</w:t>
+      </w:r>
+      <w:proofErr w:type="spellEnd"/>
+      <w:r>
+        <w:rPr>
+          <w:rFonts w:ascii="Century Gothic" w:eastAsia="Calibri" w:hAnsi="Century Gothic" w:cs="Times New Roman"/>
+          <w:lang w:val="es-CO"/>
+        </w:rPr>
+        <w:t>}</w:t>
+      </w:r>
+      <w:r>
+        <w:rPr>
+          <w:rFonts w:ascii="Century Gothic" w:eastAsia="Calibri" w:hAnsi="Century Gothic" w:cs="Times New Roman"/>
+          <w:lang w:val="es-CO"/>
+        </w:rPr>
+        <w:t>}</w:t>
+      </w:r>
+      <w:r>
+        <w:rPr>
+          <w:rFonts w:ascii="Century Gothic" w:eastAsia="Calibri" w:hAnsi="Century Gothic" w:cs="Times New Roman"/>
+          <w:lang w:val="es-CO"/>
+        </w:rPr>
+        <w:t>, quien en adelante se denominará EL RECEPTOR DE LA INFORMACIÓN – CONTRATISTA, han convenido celebrar este Acuerdo de Confidencialidad con el fin de establecer el procedimiento que regirá la custodia y no transmisión a terceros de la información distribuida a EL RECEPTOR DE LA INFORMACIÓN – CONTRATISTA, así como los derechos, responsabilidades y obligaciones inherentes en calidad de receptor de la referida información, previas las siguientes:</w:t>
       </w:r>
     </w:p>
     <w:p>
@@ -2521,7 +2715,61 @@
           <w:b/>
           <w:lang w:val="es-419"/>
         </w:rPr>
-        <w:t>{{DiaMes}} del mes de {{MesTexto}} del {{Anio}}</w:t>
+        <w:t>{{</w:t>
+      </w:r>
+      <w:proofErr w:type="spellStart"/>
+      <w:r>
+        <w:rPr>
+          <w:rFonts w:ascii="Century Gothic" w:hAnsi="Century Gothic" w:cs="Arial"/>
+          <w:b/>
+          <w:lang w:val="es-419"/>
+        </w:rPr>
+        <w:t>DiaMes</w:t>
+      </w:r>
+      <w:proofErr w:type="spellEnd"/>
+      <w:r>
+        <w:rPr>
+          <w:rFonts w:ascii="Century Gothic" w:hAnsi="Century Gothic" w:cs="Arial"/>
+          <w:b/>
+          <w:lang w:val="es-419"/>
+        </w:rPr>
+        <w:t>}} del mes de {{</w:t>
+      </w:r>
+      <w:proofErr w:type="spellStart"/>
+      <w:r>
+        <w:rPr>
+          <w:rFonts w:ascii="Century Gothic" w:hAnsi="Century Gothic" w:cs="Arial"/>
+          <w:b/>
+          <w:lang w:val="es-419"/>
+        </w:rPr>
+        <w:t>MesTexto</w:t>
+      </w:r>
+      <w:proofErr w:type="spellEnd"/>
+      <w:r>
+        <w:rPr>
+          <w:rFonts w:ascii="Century Gothic" w:hAnsi="Century Gothic" w:cs="Arial"/>
+          <w:b/>
+          <w:lang w:val="es-419"/>
+        </w:rPr>
+        <w:t>}} del {{</w:t>
+      </w:r>
+      <w:proofErr w:type="spellStart"/>
+      <w:r>
+        <w:rPr>
+          <w:rFonts w:ascii="Century Gothic" w:hAnsi="Century Gothic" w:cs="Arial"/>
+          <w:b/>
+          <w:lang w:val="es-419"/>
+        </w:rPr>
+        <w:t>Anio</w:t>
+      </w:r>
+      <w:proofErr w:type="spellEnd"/>
+      <w:r>
+        <w:rPr>
+          <w:rFonts w:ascii="Century Gothic" w:hAnsi="Century Gothic" w:cs="Arial"/>
+          <w:b/>
+          <w:lang w:val="es-419"/>
+        </w:rPr>
+        <w:t>}}</w:t>
       </w:r>
       <w:r>
         <w:rPr>
@@ -2676,7 +2924,27 @@
                 <w:sz w:val="22"/>
                 <w:szCs w:val="22"/>
               </w:rPr>
-              <w:t xml:space="preserve">{{EmpresaRepresentanteLegal}} </w:t>
+              <w:t>{{</w:t>
+            </w:r>
+            <w:proofErr w:type="spellStart"/>
+            <w:r>
+              <w:rPr>
+                <w:rFonts w:ascii="Century Gothic" w:hAnsi="Century Gothic" w:cs="Arial"/>
+                <w:b/>
+                <w:sz w:val="22"/>
+                <w:szCs w:val="22"/>
+              </w:rPr>
+              <w:t>EmpresaRepresentanteLegal</w:t>
+            </w:r>
+            <w:proofErr w:type="spellEnd"/>
+            <w:r>
+              <w:rPr>
+                <w:rFonts w:ascii="Century Gothic" w:hAnsi="Century Gothic" w:cs="Arial"/>
+                <w:b/>
+                <w:sz w:val="22"/>
+                <w:szCs w:val="22"/>
+              </w:rPr>
+              <w:t xml:space="preserve">}} </w:t>
             </w:r>
           </w:p>
           <w:p>
@@ -2697,7 +2965,27 @@
                 <w:sz w:val="22"/>
                 <w:szCs w:val="22"/>
               </w:rPr>
-              <w:t xml:space="preserve">C.C. {{EmpresaCedulaRepresentante}} </w:t>
+              <w:t>C.C. {{</w:t>
+            </w:r>
+            <w:proofErr w:type="spellStart"/>
+            <w:r>
+              <w:rPr>
+                <w:rFonts w:ascii="Century Gothic" w:hAnsi="Century Gothic" w:cs="Arial"/>
+                <w:b/>
+                <w:sz w:val="22"/>
+                <w:szCs w:val="22"/>
+              </w:rPr>
+              <w:t>EmpresaCedulaRepresentante</w:t>
+            </w:r>
+            <w:proofErr w:type="spellEnd"/>
+            <w:r>
+              <w:rPr>
+                <w:rFonts w:ascii="Century Gothic" w:hAnsi="Century Gothic" w:cs="Arial"/>
+                <w:b/>
+                <w:sz w:val="22"/>
+                <w:szCs w:val="22"/>
+              </w:rPr>
+              <w:t xml:space="preserve">}} </w:t>
             </w:r>
           </w:p>
           <w:p>
@@ -2739,7 +3027,27 @@
                 <w:sz w:val="22"/>
                 <w:szCs w:val="22"/>
               </w:rPr>
-              <w:t xml:space="preserve">{{EmpresaRazonSocial}} </w:t>
+              <w:t>{{</w:t>
+            </w:r>
+            <w:proofErr w:type="spellStart"/>
+            <w:r>
+              <w:rPr>
+                <w:rFonts w:ascii="Century Gothic" w:hAnsi="Century Gothic" w:cs="Arial"/>
+                <w:b/>
+                <w:sz w:val="22"/>
+                <w:szCs w:val="22"/>
+              </w:rPr>
+              <w:t>EmpresaRazonSocial</w:t>
+            </w:r>
+            <w:proofErr w:type="spellEnd"/>
+            <w:r>
+              <w:rPr>
+                <w:rFonts w:ascii="Century Gothic" w:hAnsi="Century Gothic" w:cs="Arial"/>
+                <w:b/>
+                <w:sz w:val="22"/>
+                <w:szCs w:val="22"/>
+              </w:rPr>
+              <w:t xml:space="preserve">}} </w:t>
             </w:r>
           </w:p>
           <w:p>
@@ -2760,7 +3068,27 @@
                 <w:sz w:val="22"/>
                 <w:szCs w:val="22"/>
               </w:rPr>
-              <w:t>NIT. {{EmpresaNit}}</w:t>
+              <w:t>NIT. {{</w:t>
+            </w:r>
+            <w:proofErr w:type="spellStart"/>
+            <w:r>
+              <w:rPr>
+                <w:rFonts w:ascii="Century Gothic" w:hAnsi="Century Gothic" w:cs="Arial"/>
+                <w:b/>
+                <w:sz w:val="22"/>
+                <w:szCs w:val="22"/>
+              </w:rPr>
+              <w:t>EmpresaNit</w:t>
+            </w:r>
+            <w:proofErr w:type="spellEnd"/>
+            <w:r>
+              <w:rPr>
+                <w:rFonts w:ascii="Century Gothic" w:hAnsi="Century Gothic" w:cs="Arial"/>
+                <w:b/>
+                <w:sz w:val="22"/>
+                <w:szCs w:val="22"/>
+              </w:rPr>
+              <w:t>}}</w:t>
             </w:r>
           </w:p>
           <w:p>
@@ -2873,7 +3201,27 @@
                 <w:sz w:val="22"/>
                 <w:szCs w:val="22"/>
               </w:rPr>
-              <w:t xml:space="preserve">{{ContratistaFirmaNombre}} </w:t>
+              <w:t>{{</w:t>
+            </w:r>
+            <w:proofErr w:type="spellStart"/>
+            <w:r>
+              <w:rPr>
+                <w:rFonts w:ascii="Century Gothic" w:hAnsi="Century Gothic" w:cs="Arial"/>
+                <w:b/>
+                <w:sz w:val="22"/>
+                <w:szCs w:val="22"/>
+              </w:rPr>
+              <w:t>ContratistaFirmaNombre</w:t>
+            </w:r>
+            <w:proofErr w:type="spellEnd"/>
+            <w:r>
+              <w:rPr>
+                <w:rFonts w:ascii="Century Gothic" w:hAnsi="Century Gothic" w:cs="Arial"/>
+                <w:b/>
+                <w:sz w:val="22"/>
+                <w:szCs w:val="22"/>
+              </w:rPr>
+              <w:t xml:space="preserve">}} </w:t>
             </w:r>
           </w:p>
           <w:p>
@@ -2894,7 +3242,27 @@
                 <w:sz w:val="22"/>
                 <w:szCs w:val="22"/>
               </w:rPr>
-              <w:t xml:space="preserve">C.C. {{ContratistaFirmaDocumento}} </w:t>
+              <w:t>C.C. {{</w:t>
+            </w:r>
+            <w:proofErr w:type="spellStart"/>
+            <w:r>
+              <w:rPr>
+                <w:rFonts w:ascii="Century Gothic" w:hAnsi="Century Gothic" w:cs="Arial"/>
+                <w:b/>
+                <w:sz w:val="22"/>
+                <w:szCs w:val="22"/>
+              </w:rPr>
+              <w:t>ContratistaFirmaDocumento</w:t>
+            </w:r>
+            <w:proofErr w:type="spellEnd"/>
+            <w:r>
+              <w:rPr>
+                <w:rFonts w:ascii="Century Gothic" w:hAnsi="Century Gothic" w:cs="Arial"/>
+                <w:b/>
+                <w:sz w:val="22"/>
+                <w:szCs w:val="22"/>
+              </w:rPr>
+              <w:t xml:space="preserve">}} </w:t>
             </w:r>
           </w:p>
           <w:p>
@@ -2915,7 +3283,27 @@
                 <w:sz w:val="22"/>
                 <w:szCs w:val="22"/>
               </w:rPr>
-              <w:t xml:space="preserve">{{ContratistaFirmaCargo}} </w:t>
+              <w:t>{{</w:t>
+            </w:r>
+            <w:proofErr w:type="spellStart"/>
+            <w:r>
+              <w:rPr>
+                <w:rFonts w:ascii="Century Gothic" w:hAnsi="Century Gothic" w:cs="Arial"/>
+                <w:b/>
+                <w:sz w:val="22"/>
+                <w:szCs w:val="22"/>
+              </w:rPr>
+              <w:t>ContratistaFirmaCargo</w:t>
+            </w:r>
+            <w:proofErr w:type="spellEnd"/>
+            <w:r>
+              <w:rPr>
+                <w:rFonts w:ascii="Century Gothic" w:hAnsi="Century Gothic" w:cs="Arial"/>
+                <w:b/>
+                <w:sz w:val="22"/>
+                <w:szCs w:val="22"/>
+              </w:rPr>
+              <w:t xml:space="preserve">}} </w:t>
             </w:r>
           </w:p>
           <w:p>
@@ -2936,7 +3324,27 @@
                 <w:sz w:val="22"/>
                 <w:szCs w:val="22"/>
               </w:rPr>
-              <w:t>NIT. {{ContratistaFirmaNit}}</w:t>
+              <w:t>NIT. {{</w:t>
+            </w:r>
+            <w:proofErr w:type="spellStart"/>
+            <w:r>
+              <w:rPr>
+                <w:rFonts w:ascii="Century Gothic" w:hAnsi="Century Gothic" w:cs="Arial"/>
+                <w:b/>
+                <w:sz w:val="22"/>
+                <w:szCs w:val="22"/>
+              </w:rPr>
+              <w:t>ContratistaFirmaNit</w:t>
+            </w:r>
+            <w:proofErr w:type="spellEnd"/>
+            <w:r>
+              <w:rPr>
+                <w:rFonts w:ascii="Century Gothic" w:hAnsi="Century Gothic" w:cs="Arial"/>
+                <w:b/>
+                <w:sz w:val="22"/>
+                <w:szCs w:val="22"/>
+              </w:rPr>
+              <w:t>}}</w:t>
             </w:r>
           </w:p>
           <w:p>
@@ -4559,6 +4967,7 @@
   <w:style w:type="character" w:default="1" w:styleId="Fuentedeprrafopredeter">
     <w:name w:val="Default Paragraph Font"/>
     <w:uiPriority w:val="1"/>
+    <w:semiHidden/>
     <w:unhideWhenUsed/>
   </w:style>
   <w:style w:type="table" w:default="1" w:styleId="Tablanormal">
@@ -5073,10 +5482,6 @@
 </file>
 
 <file path=customXml/item1.xml><?xml version="1.0" encoding="utf-8"?>
-<b:Sources xmlns:b="http://schemas.openxmlformats.org/officeDocument/2006/bibliography" xmlns="http://schemas.openxmlformats.org/officeDocument/2006/bibliography" SelectedStyle="\APASixthEditionOfficeOnline.xsl" StyleName="APA" Version="6"/>
-</file>
-
-<file path=customXml/item2.xml><?xml version="1.0" encoding="utf-8"?>
 <p:properties xmlns:p="http://schemas.microsoft.com/office/2006/metadata/properties" xmlns:xsi="http://www.w3.org/2001/XMLSchema-instance" xmlns:pc="http://schemas.microsoft.com/office/infopath/2007/PartnerControls">
   <documentManagement>
     <lcf76f155ced4ddcb4097134ff3c332f xmlns="0671de82-fb77-4741-a946-bbedde5d4f76">
@@ -5087,7 +5492,20 @@
 </p:properties>
 </file>
 
+<file path=customXml/item2.xml><?xml version="1.0" encoding="utf-8"?>
+<b:Sources xmlns:b="http://schemas.openxmlformats.org/officeDocument/2006/bibliography" xmlns="http://schemas.openxmlformats.org/officeDocument/2006/bibliography" SelectedStyle="\APASixthEditionOfficeOnline.xsl" StyleName="APA" Version="6"/>
+</file>
+
 <file path=customXml/item3.xml><?xml version="1.0" encoding="utf-8"?>
+<?mso-contentType ?>
+<FormTemplates xmlns="http://schemas.microsoft.com/sharepoint/v3/contenttype/forms">
+  <Display>DocumentLibraryForm</Display>
+  <Edit>DocumentLibraryForm</Edit>
+  <New>DocumentLibraryForm</New>
+</FormTemplates>
+</file>
+
+<file path=customXml/item4.xml><?xml version="1.0" encoding="utf-8"?>
 <ct:contentTypeSchema xmlns:ct="http://schemas.microsoft.com/office/2006/metadata/contentType" xmlns:ma="http://schemas.microsoft.com/office/2006/metadata/properties/metaAttributes" ct:_="" ma:_="" ma:contentTypeName="Documento" ma:contentTypeID="0x01010068C79E2D4FBF494D8565142F1B408D23" ma:contentTypeVersion="13" ma:contentTypeDescription="Crear nuevo documento." ma:contentTypeScope="" ma:versionID="033ef99cf88c0d3b788bf7a31a0475d4">
   <xsd:schema xmlns:xsd="http://www.w3.org/2001/XMLSchema" xmlns:xs="http://www.w3.org/2001/XMLSchema" xmlns:p="http://schemas.microsoft.com/office/2006/metadata/properties" xmlns:ns2="0671de82-fb77-4741-a946-bbedde5d4f76" xmlns:ns3="bfe36008-4467-4f6a-b17f-684c3d9d556d" targetNamespace="http://schemas.microsoft.com/office/2006/metadata/properties" ma:root="true" ma:fieldsID="67b2ee94343aeb2f8f0920204dca2d30" ns2:_="" ns3:_="">
     <xsd:import namespace="0671de82-fb77-4741-a946-bbedde5d4f76"/>
@@ -5294,24 +5712,7 @@
 </ct:contentTypeSchema>
 </file>
 
-<file path=customXml/item4.xml><?xml version="1.0" encoding="utf-8"?>
-<?mso-contentType ?>
-<FormTemplates xmlns="http://schemas.microsoft.com/sharepoint/v3/contenttype/forms">
-  <Display>DocumentLibraryForm</Display>
-  <Edit>DocumentLibraryForm</Edit>
-  <New>DocumentLibraryForm</New>
-</FormTemplates>
-</file>
-
 <file path=customXml/itemProps1.xml><?xml version="1.0" encoding="utf-8"?>
-<ds:datastoreItem xmlns:ds="http://schemas.openxmlformats.org/officeDocument/2006/customXml" ds:itemID="{EDDE749B-1ED2-4CFC-B407-B3EDC88F0351}">
-  <ds:schemaRefs>
-    <ds:schemaRef ds:uri="http://schemas.openxmlformats.org/officeDocument/2006/bibliography"/>
-  </ds:schemaRefs>
-</ds:datastoreItem>
-</file>
-
-<file path=customXml/itemProps2.xml><?xml version="1.0" encoding="utf-8"?>
 <ds:datastoreItem xmlns:ds="http://schemas.openxmlformats.org/officeDocument/2006/customXml" ds:itemID="{41AEA7D2-D02A-4A22-8DB0-806C047780AB}">
   <ds:schemaRefs>
     <ds:schemaRef ds:uri="http://schemas.microsoft.com/office/2006/metadata/properties"/>
@@ -5322,7 +5723,23 @@
 </ds:datastoreItem>
 </file>
 
+<file path=customXml/itemProps2.xml><?xml version="1.0" encoding="utf-8"?>
+<ds:datastoreItem xmlns:ds="http://schemas.openxmlformats.org/officeDocument/2006/customXml" ds:itemID="{EDDE749B-1ED2-4CFC-B407-B3EDC88F0351}">
+  <ds:schemaRefs>
+    <ds:schemaRef ds:uri="http://schemas.openxmlformats.org/officeDocument/2006/bibliography"/>
+  </ds:schemaRefs>
+</ds:datastoreItem>
+</file>
+
 <file path=customXml/itemProps3.xml><?xml version="1.0" encoding="utf-8"?>
+<ds:datastoreItem xmlns:ds="http://schemas.openxmlformats.org/officeDocument/2006/customXml" ds:itemID="{3F384A7A-5473-42CA-8DD9-691BEF5CE007}">
+  <ds:schemaRefs>
+    <ds:schemaRef ds:uri="http://schemas.microsoft.com/sharepoint/v3/contenttype/forms"/>
+  </ds:schemaRefs>
+</ds:datastoreItem>
+</file>
+
+<file path=customXml/itemProps4.xml><?xml version="1.0" encoding="utf-8"?>
 <ds:datastoreItem xmlns:ds="http://schemas.openxmlformats.org/officeDocument/2006/customXml" ds:itemID="{B4204128-4410-4A8B-ADA6-9DCFD22B6495}">
   <ds:schemaRefs>
     <ds:schemaRef ds:uri="http://schemas.microsoft.com/office/2006/metadata/contentType"/>
@@ -5339,12 +5756,4 @@
     <ds:schemaRef ds:uri="http://schemas.microsoft.com/internal/obd"/>
   </ds:schemaRefs>
 </ds:datastoreItem>
-</file>
-
-<file path=customXml/itemProps4.xml><?xml version="1.0" encoding="utf-8"?>
-<ds:datastoreItem xmlns:ds="http://schemas.openxmlformats.org/officeDocument/2006/customXml" ds:itemID="{3F384A7A-5473-42CA-8DD9-691BEF5CE007}">
-  <ds:schemaRefs>
-    <ds:schemaRef ds:uri="http://schemas.microsoft.com/sharepoint/v3/contenttype/forms"/>
-  </ds:schemaRefs>
-</ds:datastoreItem>
 </file>
</xml_diff>